<commit_message>
feat: fixing GMC Form and Template
</commit_message>
<xml_diff>
--- a/public/Template_Good_Moral_Graduate_Overlay.docx
+++ b/public/Template_Good_Moral_Graduate_Overlay.docx
@@ -320,7 +320,7 @@
           <w:lang w:val="en-PH" w:eastAsia="en-PH"/>
         </w:rPr>
         <w:pict w14:anchorId="3BF55DB5">
-          <v:group id="_x0000_s1109" style="position:absolute;left:0;text-align:left;margin-left:268.35pt;margin-top:109.35pt;width:238.3pt;height:21.45pt;z-index:251654656" coordorigin="5694,9483" coordsize="4766,429">
+          <v:group id="_x0000_s1109" style="position:absolute;left:0;text-align:left;margin-left:268.35pt;margin-top:107.85pt;width:238.3pt;height:21.45pt;z-index:251654656" coordorigin="5694,9483" coordsize="4766,429">
             <v:shape id="_x0000_s1110" type="#_x0000_t202" style="position:absolute;left:5694;top:9483;width:712;height:429" filled="f" stroked="f">
               <v:textbox style="mso-next-textbox:#_x0000_s1110">
                 <w:txbxContent>
@@ -444,6 +444,7 @@
                 </w:p>
               </w:txbxContent>
             </v:textbox>
+            <w10:wrap anchory="page"/>
           </v:shape>
         </w:pict>
       </w:r>
@@ -484,6 +485,7 @@
                 </w:p>
               </w:txbxContent>
             </v:textbox>
+            <w10:wrap anchory="page"/>
           </v:shape>
         </w:pict>
       </w:r>
@@ -774,6 +776,50 @@
     <w:lsdException w:name="Subtitle" w:qFormat="1"/>
     <w:lsdException w:name="Strong" w:qFormat="1"/>
     <w:lsdException w:name="Emphasis" w:qFormat="1"/>
+    <w:lsdException w:name="Normal Table" w:semiHidden="1" w:unhideWhenUsed="1"/>
+    <w:lsdException w:name="Table Simple 1" w:semiHidden="1" w:unhideWhenUsed="1"/>
+    <w:lsdException w:name="Table Simple 2" w:semiHidden="1" w:unhideWhenUsed="1"/>
+    <w:lsdException w:name="Table Simple 3" w:semiHidden="1" w:unhideWhenUsed="1"/>
+    <w:lsdException w:name="Table Classic 1" w:semiHidden="1" w:unhideWhenUsed="1"/>
+    <w:lsdException w:name="Table Classic 2" w:semiHidden="1" w:unhideWhenUsed="1"/>
+    <w:lsdException w:name="Table Classic 3" w:semiHidden="1" w:unhideWhenUsed="1"/>
+    <w:lsdException w:name="Table Classic 4" w:semiHidden="1" w:unhideWhenUsed="1"/>
+    <w:lsdException w:name="Table Colorful 1" w:semiHidden="1" w:unhideWhenUsed="1"/>
+    <w:lsdException w:name="Table Colorful 2" w:semiHidden="1" w:unhideWhenUsed="1"/>
+    <w:lsdException w:name="Table Colorful 3" w:semiHidden="1" w:unhideWhenUsed="1"/>
+    <w:lsdException w:name="Table Columns 1" w:semiHidden="1" w:unhideWhenUsed="1"/>
+    <w:lsdException w:name="Table Columns 2" w:semiHidden="1" w:unhideWhenUsed="1"/>
+    <w:lsdException w:name="Table Columns 3" w:semiHidden="1" w:unhideWhenUsed="1"/>
+    <w:lsdException w:name="Table Columns 4" w:semiHidden="1" w:unhideWhenUsed="1"/>
+    <w:lsdException w:name="Table Columns 5" w:semiHidden="1" w:unhideWhenUsed="1"/>
+    <w:lsdException w:name="Table Grid 1" w:semiHidden="1" w:unhideWhenUsed="1"/>
+    <w:lsdException w:name="Table Grid 2" w:semiHidden="1" w:unhideWhenUsed="1"/>
+    <w:lsdException w:name="Table Grid 3" w:semiHidden="1" w:unhideWhenUsed="1"/>
+    <w:lsdException w:name="Table Grid 4" w:semiHidden="1" w:unhideWhenUsed="1"/>
+    <w:lsdException w:name="Table Grid 5" w:semiHidden="1" w:unhideWhenUsed="1"/>
+    <w:lsdException w:name="Table Grid 6" w:semiHidden="1" w:unhideWhenUsed="1"/>
+    <w:lsdException w:name="Table Grid 7" w:semiHidden="1" w:unhideWhenUsed="1"/>
+    <w:lsdException w:name="Table Grid 8" w:semiHidden="1" w:unhideWhenUsed="1"/>
+    <w:lsdException w:name="Table List 1" w:semiHidden="1" w:unhideWhenUsed="1"/>
+    <w:lsdException w:name="Table List 2" w:semiHidden="1" w:unhideWhenUsed="1"/>
+    <w:lsdException w:name="Table List 3" w:semiHidden="1" w:unhideWhenUsed="1"/>
+    <w:lsdException w:name="Table List 4" w:semiHidden="1" w:unhideWhenUsed="1"/>
+    <w:lsdException w:name="Table List 5" w:semiHidden="1" w:unhideWhenUsed="1"/>
+    <w:lsdException w:name="Table List 6" w:semiHidden="1" w:unhideWhenUsed="1"/>
+    <w:lsdException w:name="Table List 7" w:semiHidden="1" w:unhideWhenUsed="1"/>
+    <w:lsdException w:name="Table List 8" w:semiHidden="1" w:unhideWhenUsed="1"/>
+    <w:lsdException w:name="Table 3D effects 1" w:semiHidden="1" w:unhideWhenUsed="1"/>
+    <w:lsdException w:name="Table 3D effects 2" w:semiHidden="1" w:unhideWhenUsed="1"/>
+    <w:lsdException w:name="Table 3D effects 3" w:semiHidden="1" w:unhideWhenUsed="1"/>
+    <w:lsdException w:name="Table Contemporary" w:semiHidden="1" w:unhideWhenUsed="1"/>
+    <w:lsdException w:name="Table Elegant" w:semiHidden="1" w:unhideWhenUsed="1"/>
+    <w:lsdException w:name="Table Professional" w:semiHidden="1" w:unhideWhenUsed="1"/>
+    <w:lsdException w:name="Table Subtle 1" w:semiHidden="1" w:unhideWhenUsed="1"/>
+    <w:lsdException w:name="Table Subtle 2" w:semiHidden="1" w:unhideWhenUsed="1"/>
+    <w:lsdException w:name="Table Web 1" w:semiHidden="1" w:unhideWhenUsed="1"/>
+    <w:lsdException w:name="Table Web 2" w:semiHidden="1" w:unhideWhenUsed="1"/>
+    <w:lsdException w:name="Table Web 3" w:semiHidden="1" w:unhideWhenUsed="1"/>
+    <w:lsdException w:name="Table Theme" w:semiHidden="1" w:unhideWhenUsed="1"/>
     <w:lsdException w:name="Placeholder Text" w:semiHidden="1" w:uiPriority="99"/>
     <w:lsdException w:name="No Spacing" w:uiPriority="1" w:qFormat="1"/>
     <w:lsdException w:name="Light Shading" w:uiPriority="60"/>
@@ -1028,11 +1074,15 @@
   </w:style>
   <w:style w:type="character" w:default="1" w:styleId="DefaultParagraphFont">
     <w:name w:val="Default Paragraph Font"/>
+    <w:uiPriority w:val="1"/>
     <w:semiHidden/>
+    <w:unhideWhenUsed/>
   </w:style>
   <w:style w:type="table" w:default="1" w:styleId="TableNormal">
     <w:name w:val="Normal Table"/>
+    <w:uiPriority w:val="99"/>
     <w:semiHidden/>
+    <w:unhideWhenUsed/>
     <w:tblPr>
       <w:tblInd w:w="0" w:type="dxa"/>
       <w:tblCellMar>
@@ -1045,7 +1095,9 @@
   </w:style>
   <w:style w:type="numbering" w:default="1" w:styleId="NoList">
     <w:name w:val="No List"/>
+    <w:uiPriority w:val="99"/>
     <w:semiHidden/>
+    <w:unhideWhenUsed/>
   </w:style>
   <w:style w:type="paragraph" w:styleId="BalloonText">
     <w:name w:val="Balloon Text"/>

</xml_diff>